<commit_message>
Pricing: the term is paid once up front, not chased monthly
Switch the commercial model from monthly invoicing to a single advance
invoice for the term, so neither side spends the engagement chasing
payments. The builder now headlines the amount actually due, with the
monthly equivalent beneath it so the value still reads, and says plainly
that it is paid once up front.

Paying in advance is deliberately balanced by the refund position: every
month paid for but not delivered comes back in full within 14 working
days, on cancellation by either side. That is what makes an up-front term
reasonable to ask for, so the terms page, the emailed quote and the
lawyer's draft all state the two together.

Co-Authored-By: Claude Opus 4.8 <noreply@anthropic.com>
Claude-Session: https://claude.ai/code/session_01JQsb9C4aGD5GsEfhqjfSAJ
</commit_message>
<xml_diff>
--- a/docs/Click-n-likes-Terms-of-Service-DRAFT-for-legal-review.docx
+++ b/docs/Click-n-likes-Terms-of-Service-DRAFT-for-legal-review.docx
@@ -215,7 +215,7 @@
           <w:sz w:val="21"/>
           <w:szCs w:val="21"/>
         </w:rPr>
-        <w:t xml:space="preserve">Term options of 1, 3, 6 or 12 months, billed monthly in advance. On a 6-month term the client is charged for 5 months; on a 12-month term, for 10. The free months fall at the END of the term, so they are earned by completing it.</w:t>
+        <w:t xml:space="preserve">Term options of 1, 3, 6 or 12 months, invoiced ONCE IN ADVANCE for the chargeable months. On a 6-month term the client pays for 5 and receives 6; on a 12-month term, pays for 10 and receives 12. Payment up front is deliberately balanced by a full refund of any month paid for but not delivered.</w:t>
       </w:r>
     </w:p>
     <w:p>
@@ -353,7 +353,7 @@
           <w:sz w:val="21"/>
           <w:szCs w:val="21"/>
         </w:rPr>
-        <w:t xml:space="preserve">Monthly services are supplied for the term the client selects — 1, 3, 6 or 12 months — and are invoiced monthly in advance throughout that term. A term is not a lump-sum package: the client pays month by month, and the term fixes how long the engagement runs and which incentives apply. On a 6-month term, months 1 to 5 are chargeable and month 6 is supplied at no charge. On a 12-month term, months 1 to 10 are chargeable and months 11 and 12 are supplied at no charge. The complimentary months fall at the end of the term and are earned by completing it. One-time projects are invoiced 50% to commence and 50% on delivery unless the Proposal states otherwise.</w:t>
+        <w:t xml:space="preserve">Monthly services are supplied for the term the client selects — 1, 3, 6 or 12 months — and the chargeable months of that term are invoiced once, in advance, before work begins. On a 6-month term the client pays for 5 months and receives 6. On a 12-month term the client pays for 10 months and receives 12. The complimentary months fall at the end of the term. Payment in advance is balanced by the refund position at clause 12: any month paid for but not delivered is refunded in full, so the client is never out of pocket for work not received. One-time projects are invoiced 50% to commence and 50% on delivery unless the Proposal states otherwise.</w:t>
       </w:r>
     </w:p>
     <w:p>
@@ -516,7 +516,7 @@
           <w:sz w:val="21"/>
           <w:szCs w:val="21"/>
         </w:rPr>
-        <w:t xml:space="preserve">The client may cancel at any time by giving 30 days’ written notice. During the notice period we continue to deliver the services and the fee for that period remains payable. Where the client is part-way through a 6- or 12-month term, the complimentary months at the end of that term are not reached and therefore do not apply; no penalty, exit fee or recalculation of past months is charged. A one-time project may be cancelled before delivery, with payment due only for the work completed to the date of cancellation.</w:t>
+        <w:t xml:space="preserve">The client may cancel at any time by giving 30 days’ written notice. We continue to deliver through the notice period, and every month paid for beyond it is refunded in full under clause 12. Where the client is part-way through a 6- or 12-month term, the complimentary months at the end of that term are not reached and therefore do not apply; no penalty, exit fee or recalculation of the months already delivered is charged. A one-time project may be cancelled before delivery, with payment due only for the work completed to the date of cancellation.</w:t>
       </w:r>
     </w:p>
     <w:p>
@@ -591,7 +591,7 @@
           <w:sz w:val="21"/>
           <w:szCs w:val="21"/>
         </w:rPr>
-        <w:t xml:space="preserve">Fees for services already delivered are not refundable, because the work has been performed. Any amount paid in advance for services not yet delivered is refunded in full, or credited against future work if the client prefers, within 14 working days of the engagement ending. For one-time projects, the commencement payment covers work undertaken from the date of instruction and is refundable only to the extent it exceeds the value of the work completed at the point of cancellation. Advertising spend is held by the advertising platform and never by us, so any refund of unspent budget is governed by that platform’s own rules and is claimed by the client directly. Domain, hosting, licences and third-party tools are purchased by the client in the client’s own name and are refundable only under the terms of the relevant provider.</w:t>
+        <w:t xml:space="preserve">Because the term is paid in advance, this clause is central to the bargain. Fees for services already delivered are not refundable, because the work has been performed. Any amount paid in advance for services not yet delivered is refunded in full, or credited against future work if the client prefers, within 14 working days of the engagement ending. For one-time projects, the commencement payment covers work undertaken from the date of instruction and is refundable only to the extent it exceeds the value of the work completed at the point of cancellation. Advertising spend is held by the advertising platform and never by us, so any refund of unspent budget is governed by that platform’s own rules and is claimed by the client directly. Domain, hosting, licences and third-party tools are purchased by the client in the client’s own name and are refundable only under the terms of the relevant provider.</w:t>
       </w:r>
     </w:p>
     <w:p>
@@ -929,7 +929,7 @@
           <w:sz w:val="21"/>
           <w:szCs w:val="21"/>
         </w:rPr>
-        <w:t xml:space="preserve">Is the term structure in clause 2 sound — monthly billing across a fixed term, with the complimentary months falling at the end and simply not being reached if the client leaves early? We deliberately avoided any clawback or exit penalty.</w:t>
+        <w:t xml:space="preserve">Is the term structure in clause 2 sound — the whole term invoiced in advance, balanced by the clause 12 refund of any month paid for but not delivered? We deliberately avoided any clawback or exit penalty. Please confirm that advance payment coupled with this refund promise is enforceable and fair, and flag any consumer-protection issue with taking payment before delivery.</w:t>
       </w:r>
     </w:p>
     <w:p>

</xml_diff>

<commit_message>
Terms: refunds by cause, and a right to suspend on breach
The refund clause treated every ending the same way, so a client who
breached could still claim back undelivered months. Split it by who caused
the ending: notice with no breach refunds prepaid months not yet started;
our termination for the client's default keeps the month in progress, whose
capacity is already committed, and refunds the rest; our termination for
any other reason refunds everything undelivered. Delivered work is never
refundable in any case.

Add a right to suspend work immediately where the client is in material
breach, so we stop rather than deliver into a dispute during the cure
period. Flag for counsel whether retaining the month in progress reads as
genuine compensation rather than a penalty under section 74.

Co-Authored-By: Claude Opus 4.8 <noreply@anthropic.com>
Claude-Session: https://claude.ai/code/session_01JQsb9C4aGD5GsEfhqjfSAJ
</commit_message>
<xml_diff>
--- a/docs/Click-n-likes-Terms-of-Service-DRAFT-for-legal-review.docx
+++ b/docs/Click-n-likes-Terms-of-Service-DRAFT-for-legal-review.docx
@@ -560,7 +560,7 @@
           <w:sz w:val="21"/>
           <w:szCs w:val="21"/>
         </w:rPr>
-        <w:t xml:space="preserve">Either party may terminate immediately, by written notice, if the other commits a material breach that is not remedied within 14 days of being notified of it, becomes insolvent, or is required to stop by law.</w:t>
+        <w:t xml:space="preserve">Either party may terminate immediately, by written notice, if the other commits a material breach that is not remedied within 14 days of being notified of it, becomes insolvent, or is required to stop by law. Where the Client is in material breach, we may suspend all services immediately pending termination, without prejudice to our right to retain fees already earned or otherwise payable under the Agreement.</w:t>
       </w:r>
     </w:p>
     <w:p>
@@ -591,7 +591,7 @@
           <w:sz w:val="21"/>
           <w:szCs w:val="21"/>
         </w:rPr>
-        <w:t xml:space="preserve">Because the term is paid in advance, this clause is central to the bargain. Fees for services already delivered are not refundable, because the work has been performed. Any amount paid in advance for services not yet delivered is refunded in full, or credited against future work if the client prefers, within 14 working days of the engagement ending. For one-time projects, the commencement payment covers work undertaken from the date of instruction and is refundable only to the extent it exceeds the value of the work completed at the point of cancellation. Advertising spend is held by the advertising platform and never by us, so any refund of unspent budget is governed by that platform’s own rules and is claimed by the client directly. Domain, hosting, licences and third-party tools are purchased by the client in the client’s own name and are refundable only under the terms of the relevant provider.</w:t>
+        <w:t xml:space="preserve">Because the term is paid in advance, this clause is central to the bargain, so each case is stated separately. Fees for services already delivered are never refundable, because the work has been performed. (a) Where the Client ends the engagement on notice and we are not in breach, services continue through the notice period and the fees for that period remain payable; any prepaid month that has not yet commenced is refunded within 14 working days. (b) Where we end the engagement because of the Client’s material breach, non-payment or other default, the Client is not entitled to a refund of the billing month in progress, as the capacity and work for that month are already committed; any prepaid month that has not yet commenced is refunded within 14 working days. (c) Where we end the engagement for any reason other than the Client’s breach or non-payment, all prepaid fees for services not yet delivered are refunded in full. (d) For one-time projects, the commencement payment is refundable only to the extent it exceeds the value of the work completed at the point of cancellation. (e) Advertising spend is held by the advertising platform and never by us, so any refund of unspent budget is governed by that platform’s rules and claimed by the Client directly; domain, hosting, licences and third-party tools are purchased in the Client’s own name and are refundable only under the terms of the relevant provider. [Please confirm that retaining the month in progress under (b) reflects genuine committed cost rather than a penalty, and so sits on the right side of section 74 of the Indian Contract Act, 1872.]</w:t>
       </w:r>
     </w:p>
     <w:p>
@@ -946,7 +946,7 @@
           <w:sz w:val="21"/>
           <w:szCs w:val="21"/>
         </w:rPr>
-        <w:t xml:space="preserve">Are the cancellation clauses (9 to 11) and the refund policy (clause 12) clear, fair and enforceable, and is 30 days’ notice appropriate for both sides?</w:t>
+        <w:t xml:space="preserve">Are the cancellation clauses (9 to 11) and the refund policy (clause 12) clear, fair and enforceable, and is 30 days’ notice appropriate for both sides? In particular: does retaining the billing month in progress where the Client is in default (clause 12(b)) read as genuine compensation rather than a penalty under section 74 of the Indian Contract Act, and is the immediate suspension right in clause 11 drafted safely?</w:t>
       </w:r>
     </w:p>
     <w:p>

</xml_diff>